<commit_message>
Uploaded modified level 0.9 and level 0.10 and level 0.11
</commit_message>
<xml_diff>
--- a/STM32/Level 0/Level 0.9 and 0.10.docx
+++ b/STM32/Level 0/Level 0.9 and 0.10.docx
@@ -105,17 +105,8 @@
           <w:sz w:val="18"/>
           <w:szCs w:val="18"/>
         </w:rPr>
-        <w:t xml:space="preserve">PLL / </w:t>
-      </w:r>
-      <w:proofErr w:type="spellStart"/>
-      <w:r>
-        <w:rPr>
-          <w:sz w:val="18"/>
-          <w:szCs w:val="18"/>
-        </w:rPr>
-        <w:t>prescaler</w:t>
-      </w:r>
-      <w:proofErr w:type="spellEnd"/>
+        <w:t>PLL / prescaler</w:t>
+      </w:r>
     </w:p>
     <w:p>
       <w:pPr>
@@ -235,7 +226,7 @@
           <w:szCs w:val="18"/>
         </w:rPr>
         <w:pict w14:anchorId="4146BB61">
-          <v:rect id="_x0000_i1115" style="width:0;height:1.5pt" o:hralign="center" o:hrstd="t" o:hr="t" fillcolor="#a0a0a0" stroked="f"/>
+          <v:rect id="_x0000_i1025" style="width:0;height:1.5pt" o:hralign="center" o:hrstd="t" o:hr="t" fillcolor="#a0a0a0" stroked="f"/>
         </w:pict>
       </w:r>
     </w:p>
@@ -313,6 +304,7 @@
       </w:pPr>
       <w:r>
         <w:rPr>
+          <w:noProof/>
           <w:sz w:val="18"/>
           <w:szCs w:val="18"/>
         </w:rPr>
@@ -492,6 +484,9 @@
             </m:den>
           </m:f>
           <m:r>
+            <m:rPr>
+              <m:sty m:val="p"/>
+            </m:rPr>
             <w:rPr>
               <w:sz w:val="18"/>
               <w:szCs w:val="18"/>
@@ -508,21 +503,12 @@
           <w:szCs w:val="18"/>
         </w:rPr>
       </w:pPr>
-      <w:proofErr w:type="gramStart"/>
-      <w:r>
-        <w:rPr>
-          <w:sz w:val="18"/>
-          <w:szCs w:val="18"/>
-        </w:rPr>
-        <w:t>So</w:t>
-      </w:r>
-      <w:proofErr w:type="gramEnd"/>
-      <w:r>
-        <w:rPr>
-          <w:sz w:val="18"/>
-          <w:szCs w:val="18"/>
-        </w:rPr>
-        <w:t xml:space="preserve"> for 8 MHz:</w:t>
+      <w:r>
+        <w:rPr>
+          <w:sz w:val="18"/>
+          <w:szCs w:val="18"/>
+        </w:rPr>
+        <w:t>So for 8 MHz:</w:t>
       </w:r>
     </w:p>
     <w:p>
@@ -592,6 +578,9 @@
             <m:t> ns</m:t>
           </m:r>
           <m:r>
+            <m:rPr>
+              <m:sty m:val="p"/>
+            </m:rPr>
             <w:rPr>
               <w:sz w:val="18"/>
               <w:szCs w:val="18"/>
@@ -644,23 +633,7 @@
           <w:szCs w:val="18"/>
         </w:rPr>
         <w:lastRenderedPageBreak/>
-        <w:t xml:space="preserve">Lower </w:t>
-      </w:r>
-      <w:proofErr w:type="gramStart"/>
-      <w:r>
-        <w:rPr>
-          <w:sz w:val="18"/>
-          <w:szCs w:val="18"/>
-        </w:rPr>
-        <w:t>frequency  →</w:t>
-      </w:r>
-      <w:proofErr w:type="gramEnd"/>
-      <w:r>
-        <w:rPr>
-          <w:sz w:val="18"/>
-          <w:szCs w:val="18"/>
-        </w:rPr>
-        <w:t xml:space="preserve"> longer clock period</w:t>
+        <w:t>Lower frequency  → longer clock period</w:t>
       </w:r>
     </w:p>
     <w:p>
@@ -676,7 +649,7 @@
           <w:szCs w:val="18"/>
         </w:rPr>
         <w:pict w14:anchorId="518F5A52">
-          <v:rect id="_x0000_i1116" style="width:0;height:1.5pt" o:hralign="center" o:hrstd="t" o:hr="t" fillcolor="#a0a0a0" stroked="f"/>
+          <v:rect id="_x0000_i1026" style="width:0;height:1.5pt" o:hralign="center" o:hrstd="t" o:hr="t" fillcolor="#a0a0a0" stroked="f"/>
         </w:pict>
       </w:r>
     </w:p>
@@ -1062,6 +1035,7 @@
       </w:pPr>
       <w:r>
         <w:rPr>
+          <w:noProof/>
           <w:sz w:val="18"/>
           <w:szCs w:val="18"/>
         </w:rPr>
@@ -1115,7 +1089,7 @@
           <w:szCs w:val="18"/>
         </w:rPr>
         <w:pict w14:anchorId="0388CCB7">
-          <v:rect id="_x0000_i1117" style="width:0;height:1.5pt" o:hralign="center" o:hrstd="t" o:hr="t" fillcolor="#a0a0a0" stroked="f"/>
+          <v:rect id="_x0000_i1027" style="width:0;height:1.5pt" o:hralign="center" o:hrstd="t" o:hr="t" fillcolor="#a0a0a0" stroked="f"/>
         </w:pict>
       </w:r>
     </w:p>
@@ -1298,7 +1272,7 @@
           <w:szCs w:val="18"/>
         </w:rPr>
         <w:pict w14:anchorId="3222428D">
-          <v:rect id="_x0000_i1118" style="width:0;height:1.5pt" o:hralign="center" o:hrstd="t" o:hr="t" fillcolor="#a0a0a0" stroked="f"/>
+          <v:rect id="_x0000_i1028" style="width:0;height:1.5pt" o:hralign="center" o:hrstd="t" o:hr="t" fillcolor="#a0a0a0" stroked="f"/>
         </w:pict>
       </w:r>
     </w:p>
@@ -1654,7 +1628,7 @@
           <w:szCs w:val="18"/>
         </w:rPr>
         <w:pict w14:anchorId="675FEC4B">
-          <v:rect id="_x0000_i1119" style="width:0;height:1.5pt" o:hralign="center" o:hrstd="t" o:hr="t" fillcolor="#a0a0a0" stroked="f"/>
+          <v:rect id="_x0000_i1029" style="width:0;height:1.5pt" o:hralign="center" o:hrstd="t" o:hr="t" fillcolor="#a0a0a0" stroked="f"/>
         </w:pict>
       </w:r>
     </w:p>
@@ -1748,6 +1722,7 @@
       </w:pPr>
       <w:r>
         <w:rPr>
+          <w:noProof/>
           <w:sz w:val="18"/>
           <w:szCs w:val="18"/>
         </w:rPr>
@@ -1847,7 +1822,7 @@
           <w:szCs w:val="18"/>
         </w:rPr>
         <w:pict w14:anchorId="65F8E79D">
-          <v:rect id="_x0000_i1120" style="width:0;height:1.5pt" o:hralign="center" o:hrstd="t" o:hr="t" fillcolor="#a0a0a0" stroked="f"/>
+          <v:rect id="_x0000_i1030" style="width:0;height:1.5pt" o:hralign="center" o:hrstd="t" o:hr="t" fillcolor="#a0a0a0" stroked="f"/>
         </w:pict>
       </w:r>
     </w:p>
@@ -2022,6 +1997,7 @@
       </w:r>
       <w:r>
         <w:rPr>
+          <w:noProof/>
           <w:sz w:val="18"/>
           <w:szCs w:val="18"/>
         </w:rPr>
@@ -2119,17 +2095,8 @@
           <w:sz w:val="18"/>
           <w:szCs w:val="18"/>
         </w:rPr>
-        <w:t xml:space="preserve">AHB </w:t>
-      </w:r>
-      <w:proofErr w:type="spellStart"/>
-      <w:r>
-        <w:rPr>
-          <w:sz w:val="18"/>
-          <w:szCs w:val="18"/>
-        </w:rPr>
-        <w:t>prescaler</w:t>
-      </w:r>
-      <w:proofErr w:type="spellEnd"/>
+        <w:t>AHB prescaler</w:t>
+      </w:r>
     </w:p>
     <w:p>
       <w:pPr>
@@ -2188,17 +2155,8 @@
           <w:sz w:val="18"/>
           <w:szCs w:val="18"/>
         </w:rPr>
-        <w:t xml:space="preserve">APB </w:t>
-      </w:r>
-      <w:proofErr w:type="spellStart"/>
-      <w:r>
-        <w:rPr>
-          <w:sz w:val="18"/>
-          <w:szCs w:val="18"/>
-        </w:rPr>
-        <w:t>prescalers</w:t>
-      </w:r>
-      <w:proofErr w:type="spellEnd"/>
+        <w:t>APB prescalers</w:t>
+      </w:r>
     </w:p>
     <w:p>
       <w:pPr>
@@ -2259,7 +2217,7 @@
           <w:szCs w:val="18"/>
         </w:rPr>
         <w:pict w14:anchorId="18DA613B">
-          <v:rect id="_x0000_i1121" style="width:0;height:1.5pt" o:hralign="center" o:hrstd="t" o:hr="t" fillcolor="#a0a0a0" stroked="f"/>
+          <v:rect id="_x0000_i1031" style="width:0;height:1.5pt" o:hralign="center" o:hrstd="t" o:hr="t" fillcolor="#a0a0a0" stroked="f"/>
         </w:pict>
       </w:r>
     </w:p>
@@ -2279,27 +2237,7 @@
           <w:sz w:val="18"/>
           <w:szCs w:val="18"/>
         </w:rPr>
-        <w:t xml:space="preserve">0.9.7 What's a </w:t>
-      </w:r>
-      <w:proofErr w:type="spellStart"/>
-      <w:r>
-        <w:rPr>
-          <w:b/>
-          <w:bCs/>
-          <w:sz w:val="18"/>
-          <w:szCs w:val="18"/>
-        </w:rPr>
-        <w:t>prescaler</w:t>
-      </w:r>
-      <w:proofErr w:type="spellEnd"/>
-      <w:r>
-        <w:rPr>
-          <w:b/>
-          <w:bCs/>
-          <w:sz w:val="18"/>
-          <w:szCs w:val="18"/>
-        </w:rPr>
-        <w:t>?</w:t>
+        <w:t>0.9.7 What's a prescaler?</w:t>
       </w:r>
     </w:p>
     <w:p>
@@ -2316,25 +2254,14 @@
         </w:rPr>
         <w:t xml:space="preserve">A </w:t>
       </w:r>
-      <w:proofErr w:type="spellStart"/>
-      <w:r>
-        <w:rPr>
-          <w:b/>
-          <w:bCs/>
-          <w:sz w:val="18"/>
-          <w:szCs w:val="18"/>
-        </w:rPr>
-        <w:t>prescaler</w:t>
-      </w:r>
-      <w:proofErr w:type="spellEnd"/>
-      <w:r>
-        <w:rPr>
-          <w:b/>
-          <w:bCs/>
-          <w:sz w:val="18"/>
-          <w:szCs w:val="18"/>
-        </w:rPr>
-        <w:t xml:space="preserve"> divides a clock frequency</w:t>
+      <w:r>
+        <w:rPr>
+          <w:b/>
+          <w:bCs/>
+          <w:sz w:val="18"/>
+          <w:szCs w:val="18"/>
+        </w:rPr>
+        <w:t>prescaler divides a clock frequency</w:t>
       </w:r>
       <w:r>
         <w:rPr>
@@ -2552,6 +2479,9 @@
             </m:den>
           </m:f>
           <m:r>
+            <m:rPr>
+              <m:sty m:val="p"/>
+            </m:rPr>
             <w:rPr>
               <w:sz w:val="18"/>
               <w:szCs w:val="18"/>
@@ -2604,7 +2534,7 @@
           <w:szCs w:val="18"/>
         </w:rPr>
         <w:pict w14:anchorId="0CD0DD31">
-          <v:rect id="_x0000_i1122" style="width:0;height:1.5pt" o:hralign="center" o:hrstd="t" o:hr="t" fillcolor="#a0a0a0" stroked="f"/>
+          <v:rect id="_x0000_i1032" style="width:0;height:1.5pt" o:hralign="center" o:hrstd="t" o:hr="t" fillcolor="#a0a0a0" stroked="f"/>
         </w:pict>
       </w:r>
     </w:p>
@@ -2890,21 +2820,12 @@
           <w:szCs w:val="18"/>
         </w:rPr>
       </w:pPr>
-      <w:proofErr w:type="gramStart"/>
-      <w:r>
-        <w:rPr>
-          <w:sz w:val="18"/>
-          <w:szCs w:val="18"/>
-        </w:rPr>
-        <w:t>So</w:t>
-      </w:r>
-      <w:proofErr w:type="gramEnd"/>
-      <w:r>
-        <w:rPr>
-          <w:sz w:val="18"/>
-          <w:szCs w:val="18"/>
-        </w:rPr>
-        <w:t xml:space="preserve"> when you enable:</w:t>
+      <w:r>
+        <w:rPr>
+          <w:sz w:val="18"/>
+          <w:szCs w:val="18"/>
+        </w:rPr>
+        <w:t>So when you enable:</w:t>
       </w:r>
     </w:p>
     <w:p>
@@ -2996,7 +2917,7 @@
           <w:szCs w:val="18"/>
         </w:rPr>
         <w:pict w14:anchorId="43C26297">
-          <v:rect id="_x0000_i1123" style="width:0;height:1.5pt" o:hralign="center" o:hrstd="t" o:hr="t" fillcolor="#a0a0a0" stroked="f"/>
+          <v:rect id="_x0000_i1033" style="width:0;height:1.5pt" o:hralign="center" o:hrstd="t" o:hr="t" fillcolor="#a0a0a0" stroked="f"/>
         </w:pict>
       </w:r>
     </w:p>
@@ -3130,19 +3051,8 @@
           <w:sz w:val="18"/>
           <w:szCs w:val="18"/>
         </w:rPr>
-        <w:t xml:space="preserve">Peripheral clock </w:t>
-      </w:r>
-      <w:proofErr w:type="gramStart"/>
-      <w:r>
-        <w:rPr>
-          <w:b/>
-          <w:bCs/>
-          <w:sz w:val="18"/>
-          <w:szCs w:val="18"/>
-        </w:rPr>
-        <w:t>enable</w:t>
-      </w:r>
-      <w:proofErr w:type="gramEnd"/>
+        <w:t>Peripheral clock enable</w:t>
+      </w:r>
     </w:p>
     <w:p>
       <w:pPr>
@@ -3276,17 +3186,8 @@
           <w:sz w:val="18"/>
           <w:szCs w:val="18"/>
         </w:rPr>
-        <w:t xml:space="preserve">Peripheral clock </w:t>
-      </w:r>
-      <w:proofErr w:type="gramStart"/>
-      <w:r>
-        <w:rPr>
-          <w:sz w:val="18"/>
-          <w:szCs w:val="18"/>
-        </w:rPr>
-        <w:t>enable</w:t>
-      </w:r>
-      <w:proofErr w:type="gramEnd"/>
+        <w:t>Peripheral clock enable</w:t>
+      </w:r>
     </w:p>
     <w:p>
       <w:pPr>
@@ -3316,7 +3217,7 @@
           <w:szCs w:val="18"/>
         </w:rPr>
         <w:pict w14:anchorId="134D00C4">
-          <v:rect id="_x0000_i1124" style="width:0;height:1.5pt" o:hralign="center" o:hrstd="t" o:hr="t" fillcolor="#a0a0a0" stroked="f"/>
+          <v:rect id="_x0000_i1034" style="width:0;height:1.5pt" o:hralign="center" o:hrstd="t" o:hr="t" fillcolor="#a0a0a0" stroked="f"/>
         </w:pict>
       </w:r>
     </w:p>
@@ -3649,7 +3550,7 @@
           <w:szCs w:val="18"/>
         </w:rPr>
         <w:pict w14:anchorId="0C2324BD">
-          <v:rect id="_x0000_i1125" style="width:0;height:1.5pt" o:hralign="center" o:hrstd="t" o:hr="t" fillcolor="#a0a0a0" stroked="f"/>
+          <v:rect id="_x0000_i1035" style="width:0;height:1.5pt" o:hralign="center" o:hrstd="t" o:hr="t" fillcolor="#a0a0a0" stroked="f"/>
         </w:pict>
       </w:r>
     </w:p>
@@ -3959,7 +3860,6 @@
           <w:szCs w:val="18"/>
         </w:rPr>
       </w:pPr>
-      <w:proofErr w:type="spellStart"/>
       <w:r>
         <w:rPr>
           <w:sz w:val="18"/>
@@ -3967,7 +3867,6 @@
         </w:rPr>
         <w:t>Reset_Handler</w:t>
       </w:r>
-      <w:proofErr w:type="spellEnd"/>
     </w:p>
     <w:p>
       <w:pPr>
@@ -4021,21 +3920,12 @@
           <w:szCs w:val="18"/>
         </w:rPr>
       </w:pPr>
-      <w:proofErr w:type="gramStart"/>
-      <w:r>
-        <w:rPr>
-          <w:sz w:val="18"/>
-          <w:szCs w:val="18"/>
-        </w:rPr>
-        <w:t>main(</w:t>
-      </w:r>
-      <w:proofErr w:type="gramEnd"/>
-      <w:r>
-        <w:rPr>
-          <w:sz w:val="18"/>
-          <w:szCs w:val="18"/>
-        </w:rPr>
-        <w:t>)</w:t>
+      <w:r>
+        <w:rPr>
+          <w:sz w:val="18"/>
+          <w:szCs w:val="18"/>
+        </w:rPr>
+        <w:t>main()</w:t>
       </w:r>
     </w:p>
     <w:p>
@@ -4052,7 +3942,7 @@
         </w:rPr>
         <w:lastRenderedPageBreak/>
         <w:pict w14:anchorId="3B452FB7">
-          <v:rect id="_x0000_i1126" style="width:0;height:1.5pt" o:hralign="center" o:hrstd="t" o:hr="t" fillcolor="#a0a0a0" stroked="f"/>
+          <v:rect id="_x0000_i1036" style="width:0;height:1.5pt" o:hralign="center" o:hrstd="t" o:hr="t" fillcolor="#a0a0a0" stroked="f"/>
         </w:pict>
       </w:r>
     </w:p>
@@ -4353,7 +4243,7 @@
           <w:szCs w:val="18"/>
         </w:rPr>
         <w:pict w14:anchorId="68445D24">
-          <v:rect id="_x0000_i1127" style="width:0;height:1.5pt" o:hralign="center" o:hrstd="t" o:hr="t" fillcolor="#a0a0a0" stroked="f"/>
+          <v:rect id="_x0000_i1037" style="width:0;height:1.5pt" o:hralign="center" o:hrstd="t" o:hr="t" fillcolor="#a0a0a0" stroked="f"/>
         </w:pict>
       </w:r>
     </w:p>
@@ -4486,13 +4376,94 @@
           <w:szCs w:val="18"/>
         </w:rPr>
       </w:pPr>
-      <w:r>
-        <w:rPr>
-          <w:b/>
-          <w:bCs/>
-          <w:sz w:val="18"/>
-          <w:szCs w:val="18"/>
-        </w:rPr>
+    </w:p>
+    <w:p>
+      <w:pPr>
+        <w:rPr>
+          <w:b/>
+          <w:bCs/>
+          <w:sz w:val="18"/>
+          <w:szCs w:val="18"/>
+        </w:rPr>
+      </w:pPr>
+    </w:p>
+    <w:p>
+      <w:pPr>
+        <w:rPr>
+          <w:b/>
+          <w:bCs/>
+          <w:sz w:val="18"/>
+          <w:szCs w:val="18"/>
+        </w:rPr>
+      </w:pPr>
+    </w:p>
+    <w:p>
+      <w:pPr>
+        <w:rPr>
+          <w:b/>
+          <w:bCs/>
+          <w:sz w:val="18"/>
+          <w:szCs w:val="18"/>
+        </w:rPr>
+      </w:pPr>
+    </w:p>
+    <w:p>
+      <w:pPr>
+        <w:rPr>
+          <w:b/>
+          <w:bCs/>
+          <w:sz w:val="18"/>
+          <w:szCs w:val="18"/>
+        </w:rPr>
+      </w:pPr>
+    </w:p>
+    <w:p>
+      <w:pPr>
+        <w:rPr>
+          <w:b/>
+          <w:bCs/>
+          <w:sz w:val="18"/>
+          <w:szCs w:val="18"/>
+        </w:rPr>
+      </w:pPr>
+    </w:p>
+    <w:p>
+      <w:pPr>
+        <w:rPr>
+          <w:b/>
+          <w:bCs/>
+          <w:sz w:val="18"/>
+          <w:szCs w:val="18"/>
+        </w:rPr>
+      </w:pPr>
+    </w:p>
+    <w:p>
+      <w:pPr>
+        <w:rPr>
+          <w:b/>
+          <w:bCs/>
+          <w:sz w:val="18"/>
+          <w:szCs w:val="18"/>
+        </w:rPr>
+      </w:pPr>
+    </w:p>
+    <w:p>
+      <w:pPr>
+        <w:rPr>
+          <w:b/>
+          <w:bCs/>
+          <w:sz w:val="18"/>
+          <w:szCs w:val="18"/>
+        </w:rPr>
+      </w:pPr>
+      <w:r>
+        <w:rPr>
+          <w:b/>
+          <w:bCs/>
+          <w:sz w:val="18"/>
+          <w:szCs w:val="18"/>
+        </w:rPr>
+        <w:lastRenderedPageBreak/>
         <w:t>The complete picture</w:t>
       </w:r>
     </w:p>
@@ -4536,10 +4507,10 @@
       </w:pPr>
       <w:r>
         <w:rPr>
-          <w:sz w:val="18"/>
-          <w:szCs w:val="18"/>
-        </w:rPr>
-        <w:lastRenderedPageBreak/>
+          <w:noProof/>
+          <w:sz w:val="18"/>
+          <w:szCs w:val="18"/>
+        </w:rPr>
         <w:drawing>
           <wp:inline distT="0" distB="0" distL="0" distR="0" wp14:anchorId="3ED1E4FB" wp14:editId="7D4A6B4F">
             <wp:extent cx="1687286" cy="3255314"/>
@@ -4779,7 +4750,7 @@
           <w:szCs w:val="18"/>
         </w:rPr>
         <w:pict w14:anchorId="21B609DE">
-          <v:rect id="_x0000_i1128" style="width:0;height:1.5pt" o:hralign="center" o:hrstd="t" o:hr="t" fillcolor="#a0a0a0" stroked="f"/>
+          <v:rect id="_x0000_i1038" style="width:0;height:1.5pt" o:hralign="center" o:hrstd="t" o:hr="t" fillcolor="#a0a0a0" stroked="f"/>
         </w:pict>
       </w:r>
     </w:p>
@@ -4941,6 +4912,7 @@
           <w:sz w:val="18"/>
           <w:szCs w:val="18"/>
         </w:rPr>
+        <w:lastRenderedPageBreak/>
         <w:t>Clock → provides timing</w:t>
       </w:r>
     </w:p>
@@ -4971,7 +4943,6 @@
           <w:sz w:val="18"/>
           <w:szCs w:val="18"/>
         </w:rPr>
-        <w:lastRenderedPageBreak/>
         <w:t>These three distinctions will save you a lot of confusion later.</w:t>
       </w:r>
     </w:p>
@@ -4988,7 +4959,7 @@
           <w:szCs w:val="18"/>
         </w:rPr>
         <w:pict w14:anchorId="5FA550AE">
-          <v:rect id="_x0000_i1129" style="width:0;height:1.5pt" o:hralign="center" o:hrstd="t" o:hr="t" fillcolor="#a0a0a0" stroked="f"/>
+          <v:rect id="_x0000_i1039" style="width:0;height:1.5pt" o:hralign="center" o:hrstd="t" o:hr="t" fillcolor="#a0a0a0" stroked="f"/>
         </w:pict>
       </w:r>
     </w:p>
@@ -5087,39 +5058,7 @@
           <w:sz w:val="18"/>
           <w:szCs w:val="18"/>
         </w:rPr>
-        <w:t xml:space="preserve"> What does a </w:t>
-      </w:r>
-      <w:proofErr w:type="spellStart"/>
-      <w:r>
-        <w:rPr>
-          <w:sz w:val="18"/>
-          <w:szCs w:val="18"/>
-        </w:rPr>
-        <w:t>prescaler</w:t>
-      </w:r>
-      <w:proofErr w:type="spellEnd"/>
-      <w:r>
-        <w:rPr>
-          <w:sz w:val="18"/>
-          <w:szCs w:val="18"/>
-        </w:rPr>
-        <w:t xml:space="preserve"> </w:t>
-      </w:r>
-      <w:proofErr w:type="spellStart"/>
-      <w:r>
-        <w:rPr>
-          <w:sz w:val="18"/>
-          <w:szCs w:val="18"/>
-        </w:rPr>
-        <w:t>do</w:t>
-      </w:r>
-      <w:proofErr w:type="spellEnd"/>
-      <w:r>
-        <w:rPr>
-          <w:sz w:val="18"/>
-          <w:szCs w:val="18"/>
-        </w:rPr>
-        <w:t xml:space="preserve"> to a clock frequency?</w:t>
+        <w:t xml:space="preserve"> What does a prescaler do to a clock frequency?</w:t>
       </w:r>
     </w:p>
     <w:p>
@@ -5253,37 +5192,12 @@
           <w:szCs w:val="18"/>
         </w:rPr>
       </w:pPr>
-      <w:proofErr w:type="spellStart"/>
-      <w:r>
-        <w:rPr>
-          <w:sz w:val="18"/>
-          <w:szCs w:val="18"/>
-        </w:rPr>
-        <w:t>prescaler</w:t>
-      </w:r>
-      <w:proofErr w:type="spellEnd"/>
-      <w:r>
-        <w:rPr>
-          <w:sz w:val="18"/>
-          <w:szCs w:val="18"/>
-        </w:rPr>
-        <w:t xml:space="preserve"> divides/</w:t>
-      </w:r>
-      <w:proofErr w:type="spellStart"/>
-      <w:r>
-        <w:rPr>
-          <w:sz w:val="18"/>
-          <w:szCs w:val="18"/>
-        </w:rPr>
-        <w:t>muiltiplies</w:t>
-      </w:r>
-      <w:proofErr w:type="spellEnd"/>
-      <w:r>
-        <w:rPr>
-          <w:sz w:val="18"/>
-          <w:szCs w:val="18"/>
-        </w:rPr>
-        <w:t xml:space="preserve"> the frequency in order to get our desired frequency/ clock cycle</w:t>
+      <w:r>
+        <w:rPr>
+          <w:sz w:val="18"/>
+          <w:szCs w:val="18"/>
+        </w:rPr>
+        <w:t>prescaler divides/muiltiplies the frequency in order to get our desired frequency/ clock cycle</w:t>
       </w:r>
     </w:p>
     <w:p>
@@ -5302,23 +5216,7 @@
           <w:sz w:val="18"/>
           <w:szCs w:val="18"/>
         </w:rPr>
-        <w:t xml:space="preserve">that line enables the clock to apb2 bus to </w:t>
-      </w:r>
-      <w:proofErr w:type="spellStart"/>
-      <w:r>
-        <w:rPr>
-          <w:sz w:val="18"/>
-          <w:szCs w:val="18"/>
-        </w:rPr>
-        <w:t>gpioa</w:t>
-      </w:r>
-      <w:proofErr w:type="spellEnd"/>
-      <w:r>
-        <w:rPr>
-          <w:sz w:val="18"/>
-          <w:szCs w:val="18"/>
-        </w:rPr>
-        <w:t xml:space="preserve"> and clock frequency is the speed of clock</w:t>
+        <w:t>that line enables the clock to apb2 bus to gpioa and clock frequency is the speed of clock</w:t>
       </w:r>
     </w:p>
     <w:p>
@@ -5485,7 +5383,6 @@
           </m:r>
           <m:r>
             <w:rPr>
-              <w:i/>
               <w:sz w:val="18"/>
               <w:szCs w:val="18"/>
             </w:rPr>
@@ -5501,21 +5398,12 @@
           <w:szCs w:val="18"/>
         </w:rPr>
       </w:pPr>
-      <w:proofErr w:type="gramStart"/>
-      <w:r>
-        <w:rPr>
-          <w:sz w:val="18"/>
-          <w:szCs w:val="18"/>
-        </w:rPr>
-        <w:t>So</w:t>
-      </w:r>
-      <w:proofErr w:type="gramEnd"/>
-      <w:r>
-        <w:rPr>
-          <w:sz w:val="18"/>
-          <w:szCs w:val="18"/>
-        </w:rPr>
-        <w:t xml:space="preserve"> the clock completes </w:t>
+      <w:r>
+        <w:rPr>
+          <w:sz w:val="18"/>
+          <w:szCs w:val="18"/>
+        </w:rPr>
+        <w:t xml:space="preserve">So the clock completes </w:t>
       </w:r>
       <w:r>
         <w:rPr>
@@ -5598,6 +5486,9 @@
             </m:den>
           </m:f>
           <m:r>
+            <m:rPr>
+              <m:sty m:val="p"/>
+            </m:rPr>
             <w:rPr>
               <w:sz w:val="18"/>
               <w:szCs w:val="18"/>
@@ -5729,7 +5620,6 @@
           </m:r>
           <m:r>
             <w:rPr>
-              <w:i/>
               <w:sz w:val="18"/>
               <w:szCs w:val="18"/>
             </w:rPr>
@@ -5781,7 +5671,7 @@
           <w:szCs w:val="18"/>
         </w:rPr>
         <w:pict w14:anchorId="245EF5C9">
-          <v:rect id="_x0000_i1190" style="width:0;height:1.5pt" o:hralign="center" o:hrstd="t" o:hr="t" fillcolor="#a0a0a0" stroked="f"/>
+          <v:rect id="_x0000_i1040" style="width:0;height:1.5pt" o:hralign="center" o:hrstd="t" o:hr="t" fillcolor="#a0a0a0" stroked="f"/>
         </w:pict>
       </w:r>
     </w:p>
@@ -5801,19 +5691,9 @@
           <w:sz w:val="18"/>
           <w:szCs w:val="18"/>
         </w:rPr>
-        <w:t xml:space="preserve">2. </w:t>
-      </w:r>
-      <w:proofErr w:type="spellStart"/>
-      <w:r>
-        <w:rPr>
-          <w:b/>
-          <w:bCs/>
-          <w:sz w:val="18"/>
-          <w:szCs w:val="18"/>
-        </w:rPr>
-        <w:t>Prescaler</w:t>
-      </w:r>
-      <w:proofErr w:type="spellEnd"/>
+        <w:lastRenderedPageBreak/>
+        <w:t>2. Prescaler</w:t>
+      </w:r>
     </w:p>
     <w:p>
       <w:pPr>
@@ -5843,7 +5723,6 @@
           <w:sz w:val="18"/>
           <w:szCs w:val="18"/>
         </w:rPr>
-        <w:lastRenderedPageBreak/>
         <w:t>⚠️</w:t>
       </w:r>
       <w:r>
@@ -5867,23 +5746,7 @@
           <w:sz w:val="18"/>
           <w:szCs w:val="18"/>
         </w:rPr>
-        <w:t xml:space="preserve"> A </w:t>
-      </w:r>
-      <w:proofErr w:type="spellStart"/>
-      <w:r>
-        <w:rPr>
-          <w:sz w:val="18"/>
-          <w:szCs w:val="18"/>
-        </w:rPr>
-        <w:t>prescaler</w:t>
-      </w:r>
-      <w:proofErr w:type="spellEnd"/>
-      <w:r>
-        <w:rPr>
-          <w:sz w:val="18"/>
-          <w:szCs w:val="18"/>
-        </w:rPr>
-        <w:t xml:space="preserve"> is fundamentally used to </w:t>
+        <w:t xml:space="preserve"> A prescaler is fundamentally used to </w:t>
       </w:r>
       <w:r>
         <w:rPr>
@@ -6005,6 +5868,9 @@
             </m:den>
           </m:f>
           <m:r>
+            <m:rPr>
+              <m:sty m:val="p"/>
+            </m:rPr>
             <w:rPr>
               <w:sz w:val="18"/>
               <w:szCs w:val="18"/>
@@ -6071,23 +5937,7 @@
           <w:sz w:val="18"/>
           <w:szCs w:val="18"/>
         </w:rPr>
-        <w:t xml:space="preserve">   | APB </w:t>
-      </w:r>
-      <w:proofErr w:type="spellStart"/>
-      <w:r>
-        <w:rPr>
-          <w:sz w:val="18"/>
-          <w:szCs w:val="18"/>
-        </w:rPr>
-        <w:t>prescaler</w:t>
-      </w:r>
-      <w:proofErr w:type="spellEnd"/>
-      <w:r>
-        <w:rPr>
-          <w:sz w:val="18"/>
-          <w:szCs w:val="18"/>
-        </w:rPr>
-        <w:t xml:space="preserve"> ÷2</w:t>
+        <w:t xml:space="preserve">   | APB prescaler ÷2</w:t>
       </w:r>
     </w:p>
     <w:p>
@@ -6148,17 +5998,113 @@
           <w:sz w:val="18"/>
           <w:szCs w:val="18"/>
         </w:rPr>
-        <w:t xml:space="preserve"> can be used to derive a higher or otherwise different clock from a source. Don't mix PLL and </w:t>
-      </w:r>
-      <w:proofErr w:type="spellStart"/>
-      <w:r>
-        <w:rPr>
-          <w:sz w:val="18"/>
-          <w:szCs w:val="18"/>
-        </w:rPr>
-        <w:t>prescaler</w:t>
-      </w:r>
-      <w:proofErr w:type="spellEnd"/>
+        <w:t xml:space="preserve"> can be used to derive a higher or otherwise different clock from a source. Don't mix PLL and prescaler.</w:t>
+      </w:r>
+    </w:p>
+    <w:p>
+      <w:pPr>
+        <w:rPr>
+          <w:sz w:val="18"/>
+          <w:szCs w:val="18"/>
+        </w:rPr>
+      </w:pPr>
+      <w:r>
+        <w:rPr>
+          <w:sz w:val="18"/>
+          <w:szCs w:val="18"/>
+        </w:rPr>
+        <w:pict w14:anchorId="6A07E447">
+          <v:rect id="_x0000_i1041" style="width:0;height:1.5pt" o:hralign="center" o:hrstd="t" o:hr="t" fillcolor="#a0a0a0" stroked="f"/>
+        </w:pict>
+      </w:r>
+    </w:p>
+    <w:p>
+      <w:pPr>
+        <w:rPr>
+          <w:b/>
+          <w:bCs/>
+          <w:sz w:val="18"/>
+          <w:szCs w:val="18"/>
+        </w:rPr>
+      </w:pPr>
+      <w:r>
+        <w:rPr>
+          <w:b/>
+          <w:bCs/>
+          <w:sz w:val="18"/>
+          <w:szCs w:val="18"/>
+        </w:rPr>
+        <w:t>3. RCC_APB2ENR |= (1 &lt;&lt; 2)</w:t>
+      </w:r>
+    </w:p>
+    <w:p>
+      <w:pPr>
+        <w:rPr>
+          <w:sz w:val="18"/>
+          <w:szCs w:val="18"/>
+        </w:rPr>
+      </w:pPr>
+      <w:r>
+        <w:rPr>
+          <w:sz w:val="18"/>
+          <w:szCs w:val="18"/>
+        </w:rPr>
+        <w:t>Your basic idea is correct, but one wording needs fixing.</w:t>
+      </w:r>
+    </w:p>
+    <w:p>
+      <w:pPr>
+        <w:rPr>
+          <w:sz w:val="18"/>
+          <w:szCs w:val="18"/>
+        </w:rPr>
+      </w:pPr>
+      <w:r>
+        <w:rPr>
+          <w:sz w:val="18"/>
+          <w:szCs w:val="18"/>
+        </w:rPr>
+        <w:t>This line:</w:t>
+      </w:r>
+    </w:p>
+    <w:p>
+      <w:pPr>
+        <w:rPr>
+          <w:sz w:val="18"/>
+          <w:szCs w:val="18"/>
+        </w:rPr>
+      </w:pPr>
+      <w:r>
+        <w:rPr>
+          <w:sz w:val="18"/>
+          <w:szCs w:val="18"/>
+        </w:rPr>
+        <w:t>RCC_APB2ENR |= (1 &lt;&lt; 2);</w:t>
+      </w:r>
+    </w:p>
+    <w:p>
+      <w:pPr>
+        <w:rPr>
+          <w:sz w:val="18"/>
+          <w:szCs w:val="18"/>
+        </w:rPr>
+      </w:pPr>
+      <w:r>
+        <w:rPr>
+          <w:sz w:val="18"/>
+          <w:szCs w:val="18"/>
+        </w:rPr>
+        <w:t xml:space="preserve">does </w:t>
+      </w:r>
+      <w:r>
+        <w:rPr>
+          <w:b/>
+          <w:bCs/>
+          <w:sz w:val="18"/>
+          <w:szCs w:val="18"/>
+        </w:rPr>
+        <w:t>not configure the APB2 frequency</w:t>
+      </w:r>
       <w:r>
         <w:rPr>
           <w:sz w:val="18"/>
@@ -6179,8 +6125,227 @@
           <w:sz w:val="18"/>
           <w:szCs w:val="18"/>
         </w:rPr>
-        <w:pict w14:anchorId="6A07E447">
-          <v:rect id="_x0000_i1191" style="width:0;height:1.5pt" o:hralign="center" o:hrstd="t" o:hr="t" fillcolor="#a0a0a0" stroked="f"/>
+        <w:t xml:space="preserve">It </w:t>
+      </w:r>
+      <w:r>
+        <w:rPr>
+          <w:b/>
+          <w:bCs/>
+          <w:sz w:val="18"/>
+          <w:szCs w:val="18"/>
+        </w:rPr>
+        <w:t>enables the clock to GPIOA</w:t>
+      </w:r>
+      <w:r>
+        <w:rPr>
+          <w:sz w:val="18"/>
+          <w:szCs w:val="18"/>
+        </w:rPr>
+        <w:t xml:space="preserve"> through the APB2 peripheral clock enable mechanism.</w:t>
+      </w:r>
+    </w:p>
+    <w:p>
+      <w:pPr>
+        <w:rPr>
+          <w:sz w:val="18"/>
+          <w:szCs w:val="18"/>
+        </w:rPr>
+      </w:pPr>
+      <w:r>
+        <w:rPr>
+          <w:sz w:val="18"/>
+          <w:szCs w:val="18"/>
+        </w:rPr>
+        <w:t>Think:</w:t>
+      </w:r>
+    </w:p>
+    <w:p>
+      <w:pPr>
+        <w:rPr>
+          <w:sz w:val="18"/>
+          <w:szCs w:val="18"/>
+        </w:rPr>
+      </w:pPr>
+      <w:r>
+        <w:rPr>
+          <w:sz w:val="18"/>
+          <w:szCs w:val="18"/>
+        </w:rPr>
+        <w:t>Clock configuration</w:t>
+      </w:r>
+    </w:p>
+    <w:p>
+      <w:pPr>
+        <w:rPr>
+          <w:sz w:val="18"/>
+          <w:szCs w:val="18"/>
+        </w:rPr>
+      </w:pPr>
+      <w:r>
+        <w:rPr>
+          <w:sz w:val="18"/>
+          <w:szCs w:val="18"/>
+        </w:rPr>
+        <w:t xml:space="preserve">        ↓</w:t>
+      </w:r>
+    </w:p>
+    <w:p>
+      <w:pPr>
+        <w:rPr>
+          <w:sz w:val="18"/>
+          <w:szCs w:val="18"/>
+        </w:rPr>
+      </w:pPr>
+      <w:r>
+        <w:rPr>
+          <w:sz w:val="18"/>
+          <w:szCs w:val="18"/>
+        </w:rPr>
+        <w:t>"What frequency is APB2 running at?"</w:t>
+      </w:r>
+    </w:p>
+    <w:p>
+      <w:pPr>
+        <w:rPr>
+          <w:sz w:val="18"/>
+          <w:szCs w:val="18"/>
+        </w:rPr>
+      </w:pPr>
+      <w:r>
+        <w:rPr>
+          <w:sz w:val="18"/>
+          <w:szCs w:val="18"/>
+        </w:rPr>
+        <w:t xml:space="preserve">        ↓</w:t>
+      </w:r>
+    </w:p>
+    <w:p>
+      <w:pPr>
+        <w:rPr>
+          <w:sz w:val="18"/>
+          <w:szCs w:val="18"/>
+        </w:rPr>
+      </w:pPr>
+      <w:r>
+        <w:rPr>
+          <w:sz w:val="18"/>
+          <w:szCs w:val="18"/>
+        </w:rPr>
+        <w:t>PCLK2</w:t>
+      </w:r>
+    </w:p>
+    <w:p>
+      <w:pPr>
+        <w:rPr>
+          <w:sz w:val="18"/>
+          <w:szCs w:val="18"/>
+        </w:rPr>
+      </w:pPr>
+    </w:p>
+    <w:p>
+      <w:pPr>
+        <w:rPr>
+          <w:sz w:val="18"/>
+          <w:szCs w:val="18"/>
+        </w:rPr>
+      </w:pPr>
+      <w:r>
+        <w:rPr>
+          <w:sz w:val="18"/>
+          <w:szCs w:val="18"/>
+        </w:rPr>
+        <w:t>Clock enable</w:t>
+      </w:r>
+    </w:p>
+    <w:p>
+      <w:pPr>
+        <w:rPr>
+          <w:sz w:val="18"/>
+          <w:szCs w:val="18"/>
+        </w:rPr>
+      </w:pPr>
+      <w:r>
+        <w:rPr>
+          <w:sz w:val="18"/>
+          <w:szCs w:val="18"/>
+        </w:rPr>
+        <w:t xml:space="preserve">        ↓</w:t>
+      </w:r>
+    </w:p>
+    <w:p>
+      <w:pPr>
+        <w:rPr>
+          <w:sz w:val="18"/>
+          <w:szCs w:val="18"/>
+        </w:rPr>
+      </w:pPr>
+      <w:r>
+        <w:rPr>
+          <w:sz w:val="18"/>
+          <w:szCs w:val="18"/>
+        </w:rPr>
+        <w:t>"Is GPIOA allowed to receive/use its peripheral clock?"</w:t>
+      </w:r>
+    </w:p>
+    <w:p>
+      <w:pPr>
+        <w:rPr>
+          <w:sz w:val="18"/>
+          <w:szCs w:val="18"/>
+        </w:rPr>
+      </w:pPr>
+      <w:r>
+        <w:rPr>
+          <w:sz w:val="18"/>
+          <w:szCs w:val="18"/>
+        </w:rPr>
+        <w:t xml:space="preserve">        ↓</w:t>
+      </w:r>
+    </w:p>
+    <w:p>
+      <w:pPr>
+        <w:rPr>
+          <w:sz w:val="18"/>
+          <w:szCs w:val="18"/>
+        </w:rPr>
+      </w:pPr>
+      <w:r>
+        <w:rPr>
+          <w:sz w:val="18"/>
+          <w:szCs w:val="18"/>
+        </w:rPr>
+        <w:t>IOPAEN = 1</w:t>
+      </w:r>
+    </w:p>
+    <w:p>
+      <w:pPr>
+        <w:rPr>
+          <w:sz w:val="18"/>
+          <w:szCs w:val="18"/>
+        </w:rPr>
+      </w:pPr>
+      <w:r>
+        <w:rPr>
+          <w:sz w:val="18"/>
+          <w:szCs w:val="18"/>
+        </w:rPr>
+        <w:t>So these are two different jobs.</w:t>
+      </w:r>
+    </w:p>
+    <w:p>
+      <w:pPr>
+        <w:rPr>
+          <w:sz w:val="18"/>
+          <w:szCs w:val="18"/>
+        </w:rPr>
+      </w:pPr>
+      <w:r>
+        <w:rPr>
+          <w:sz w:val="18"/>
+          <w:szCs w:val="18"/>
+        </w:rPr>
+        <w:pict w14:anchorId="4BCD63D7">
+          <v:rect id="_x0000_i1042" style="width:0;height:1.5pt" o:hralign="center" o:hrstd="t" o:hr="t" fillcolor="#a0a0a0" stroked="f"/>
         </w:pict>
       </w:r>
     </w:p>
@@ -6200,355 +6365,6 @@
           <w:sz w:val="18"/>
           <w:szCs w:val="18"/>
         </w:rPr>
-        <w:t>3. RCC_APB2ENR |= (1 &lt;&lt; 2)</w:t>
-      </w:r>
-    </w:p>
-    <w:p>
-      <w:pPr>
-        <w:rPr>
-          <w:sz w:val="18"/>
-          <w:szCs w:val="18"/>
-        </w:rPr>
-      </w:pPr>
-      <w:r>
-        <w:rPr>
-          <w:sz w:val="18"/>
-          <w:szCs w:val="18"/>
-        </w:rPr>
-        <w:t>Your basic idea is correct, but one wording needs fixing.</w:t>
-      </w:r>
-    </w:p>
-    <w:p>
-      <w:pPr>
-        <w:rPr>
-          <w:sz w:val="18"/>
-          <w:szCs w:val="18"/>
-        </w:rPr>
-      </w:pPr>
-      <w:r>
-        <w:rPr>
-          <w:sz w:val="18"/>
-          <w:szCs w:val="18"/>
-        </w:rPr>
-        <w:t>This line:</w:t>
-      </w:r>
-    </w:p>
-    <w:p>
-      <w:pPr>
-        <w:rPr>
-          <w:sz w:val="18"/>
-          <w:szCs w:val="18"/>
-        </w:rPr>
-      </w:pPr>
-      <w:r>
-        <w:rPr>
-          <w:sz w:val="18"/>
-          <w:szCs w:val="18"/>
-        </w:rPr>
-        <w:t>RCC_APB2ENR |= (1 &lt;&lt; 2);</w:t>
-      </w:r>
-    </w:p>
-    <w:p>
-      <w:pPr>
-        <w:rPr>
-          <w:sz w:val="18"/>
-          <w:szCs w:val="18"/>
-        </w:rPr>
-      </w:pPr>
-      <w:r>
-        <w:rPr>
-          <w:sz w:val="18"/>
-          <w:szCs w:val="18"/>
-        </w:rPr>
-        <w:t xml:space="preserve">does </w:t>
-      </w:r>
-      <w:r>
-        <w:rPr>
-          <w:b/>
-          <w:bCs/>
-          <w:sz w:val="18"/>
-          <w:szCs w:val="18"/>
-        </w:rPr>
-        <w:t>not configure the APB2 frequency</w:t>
-      </w:r>
-      <w:r>
-        <w:rPr>
-          <w:sz w:val="18"/>
-          <w:szCs w:val="18"/>
-        </w:rPr>
-        <w:t>.</w:t>
-      </w:r>
-    </w:p>
-    <w:p>
-      <w:pPr>
-        <w:rPr>
-          <w:sz w:val="18"/>
-          <w:szCs w:val="18"/>
-        </w:rPr>
-      </w:pPr>
-      <w:r>
-        <w:rPr>
-          <w:sz w:val="18"/>
-          <w:szCs w:val="18"/>
-        </w:rPr>
-        <w:t xml:space="preserve">It </w:t>
-      </w:r>
-      <w:r>
-        <w:rPr>
-          <w:b/>
-          <w:bCs/>
-          <w:sz w:val="18"/>
-          <w:szCs w:val="18"/>
-        </w:rPr>
-        <w:t>enables the clock to GPIOA</w:t>
-      </w:r>
-      <w:r>
-        <w:rPr>
-          <w:sz w:val="18"/>
-          <w:szCs w:val="18"/>
-        </w:rPr>
-        <w:t xml:space="preserve"> through the APB2 peripheral clock enable mechanism.</w:t>
-      </w:r>
-    </w:p>
-    <w:p>
-      <w:pPr>
-        <w:rPr>
-          <w:sz w:val="18"/>
-          <w:szCs w:val="18"/>
-        </w:rPr>
-      </w:pPr>
-      <w:r>
-        <w:rPr>
-          <w:sz w:val="18"/>
-          <w:szCs w:val="18"/>
-        </w:rPr>
-        <w:t>Think:</w:t>
-      </w:r>
-    </w:p>
-    <w:p>
-      <w:pPr>
-        <w:rPr>
-          <w:sz w:val="18"/>
-          <w:szCs w:val="18"/>
-        </w:rPr>
-      </w:pPr>
-      <w:r>
-        <w:rPr>
-          <w:sz w:val="18"/>
-          <w:szCs w:val="18"/>
-        </w:rPr>
-        <w:t>Clock configuration</w:t>
-      </w:r>
-    </w:p>
-    <w:p>
-      <w:pPr>
-        <w:rPr>
-          <w:sz w:val="18"/>
-          <w:szCs w:val="18"/>
-        </w:rPr>
-      </w:pPr>
-      <w:r>
-        <w:rPr>
-          <w:sz w:val="18"/>
-          <w:szCs w:val="18"/>
-        </w:rPr>
-        <w:t xml:space="preserve">        ↓</w:t>
-      </w:r>
-    </w:p>
-    <w:p>
-      <w:pPr>
-        <w:rPr>
-          <w:sz w:val="18"/>
-          <w:szCs w:val="18"/>
-        </w:rPr>
-      </w:pPr>
-      <w:r>
-        <w:rPr>
-          <w:sz w:val="18"/>
-          <w:szCs w:val="18"/>
-        </w:rPr>
-        <w:t>"What frequency is APB2 running at?"</w:t>
-      </w:r>
-    </w:p>
-    <w:p>
-      <w:pPr>
-        <w:rPr>
-          <w:sz w:val="18"/>
-          <w:szCs w:val="18"/>
-        </w:rPr>
-      </w:pPr>
-      <w:r>
-        <w:rPr>
-          <w:sz w:val="18"/>
-          <w:szCs w:val="18"/>
-        </w:rPr>
-        <w:t xml:space="preserve">        ↓</w:t>
-      </w:r>
-    </w:p>
-    <w:p>
-      <w:pPr>
-        <w:rPr>
-          <w:sz w:val="18"/>
-          <w:szCs w:val="18"/>
-        </w:rPr>
-      </w:pPr>
-      <w:r>
-        <w:rPr>
-          <w:sz w:val="18"/>
-          <w:szCs w:val="18"/>
-        </w:rPr>
-        <w:t>PCLK2</w:t>
-      </w:r>
-    </w:p>
-    <w:p>
-      <w:pPr>
-        <w:rPr>
-          <w:sz w:val="18"/>
-          <w:szCs w:val="18"/>
-        </w:rPr>
-      </w:pPr>
-    </w:p>
-    <w:p>
-      <w:pPr>
-        <w:rPr>
-          <w:sz w:val="18"/>
-          <w:szCs w:val="18"/>
-        </w:rPr>
-      </w:pPr>
-      <w:r>
-        <w:rPr>
-          <w:sz w:val="18"/>
-          <w:szCs w:val="18"/>
-        </w:rPr>
-        <w:t xml:space="preserve">Clock </w:t>
-      </w:r>
-      <w:proofErr w:type="gramStart"/>
-      <w:r>
-        <w:rPr>
-          <w:sz w:val="18"/>
-          <w:szCs w:val="18"/>
-        </w:rPr>
-        <w:t>enable</w:t>
-      </w:r>
-      <w:proofErr w:type="gramEnd"/>
-    </w:p>
-    <w:p>
-      <w:pPr>
-        <w:rPr>
-          <w:sz w:val="18"/>
-          <w:szCs w:val="18"/>
-        </w:rPr>
-      </w:pPr>
-      <w:r>
-        <w:rPr>
-          <w:sz w:val="18"/>
-          <w:szCs w:val="18"/>
-        </w:rPr>
-        <w:t xml:space="preserve">        ↓</w:t>
-      </w:r>
-    </w:p>
-    <w:p>
-      <w:pPr>
-        <w:rPr>
-          <w:sz w:val="18"/>
-          <w:szCs w:val="18"/>
-        </w:rPr>
-      </w:pPr>
-      <w:r>
-        <w:rPr>
-          <w:sz w:val="18"/>
-          <w:szCs w:val="18"/>
-        </w:rPr>
-        <w:t>"Is GPIOA allowed to receive/use its peripheral clock?"</w:t>
-      </w:r>
-    </w:p>
-    <w:p>
-      <w:pPr>
-        <w:rPr>
-          <w:sz w:val="18"/>
-          <w:szCs w:val="18"/>
-        </w:rPr>
-      </w:pPr>
-      <w:r>
-        <w:rPr>
-          <w:sz w:val="18"/>
-          <w:szCs w:val="18"/>
-        </w:rPr>
-        <w:t xml:space="preserve">        ↓</w:t>
-      </w:r>
-    </w:p>
-    <w:p>
-      <w:pPr>
-        <w:rPr>
-          <w:sz w:val="18"/>
-          <w:szCs w:val="18"/>
-        </w:rPr>
-      </w:pPr>
-      <w:r>
-        <w:rPr>
-          <w:sz w:val="18"/>
-          <w:szCs w:val="18"/>
-        </w:rPr>
-        <w:t>IOPAEN = 1</w:t>
-      </w:r>
-    </w:p>
-    <w:p>
-      <w:pPr>
-        <w:rPr>
-          <w:sz w:val="18"/>
-          <w:szCs w:val="18"/>
-        </w:rPr>
-      </w:pPr>
-      <w:proofErr w:type="gramStart"/>
-      <w:r>
-        <w:rPr>
-          <w:sz w:val="18"/>
-          <w:szCs w:val="18"/>
-        </w:rPr>
-        <w:t>So</w:t>
-      </w:r>
-      <w:proofErr w:type="gramEnd"/>
-      <w:r>
-        <w:rPr>
-          <w:sz w:val="18"/>
-          <w:szCs w:val="18"/>
-        </w:rPr>
-        <w:t xml:space="preserve"> these are two different jobs.</w:t>
-      </w:r>
-    </w:p>
-    <w:p>
-      <w:pPr>
-        <w:rPr>
-          <w:sz w:val="18"/>
-          <w:szCs w:val="18"/>
-        </w:rPr>
-      </w:pPr>
-      <w:r>
-        <w:rPr>
-          <w:sz w:val="18"/>
-          <w:szCs w:val="18"/>
-        </w:rPr>
-        <w:pict w14:anchorId="4BCD63D7">
-          <v:rect id="_x0000_i1192" style="width:0;height:1.5pt" o:hralign="center" o:hrstd="t" o:hr="t" fillcolor="#a0a0a0" stroked="f"/>
-        </w:pict>
-      </w:r>
-    </w:p>
-    <w:p>
-      <w:pPr>
-        <w:rPr>
-          <w:b/>
-          <w:bCs/>
-          <w:sz w:val="18"/>
-          <w:szCs w:val="18"/>
-        </w:rPr>
-      </w:pPr>
-      <w:r>
-        <w:rPr>
-          <w:b/>
-          <w:bCs/>
-          <w:sz w:val="18"/>
-          <w:szCs w:val="18"/>
-        </w:rPr>
         <w:t>4. Reset</w:t>
       </w:r>
     </w:p>
@@ -6579,6 +6395,7 @@
           <w:sz w:val="18"/>
           <w:szCs w:val="18"/>
         </w:rPr>
+        <w:lastRenderedPageBreak/>
         <w:t>More precise version:</w:t>
       </w:r>
     </w:p>
@@ -6611,7 +6428,6 @@
           <w:sz w:val="18"/>
           <w:szCs w:val="18"/>
         </w:rPr>
-        <w:lastRenderedPageBreak/>
         <w:t xml:space="preserve">One small correction: reset does </w:t>
       </w:r>
       <w:r>
@@ -6734,7 +6550,7 @@
           <w:szCs w:val="18"/>
         </w:rPr>
         <w:pict w14:anchorId="217C0619">
-          <v:rect id="_x0000_i1193" style="width:0;height:1.5pt" o:hralign="center" o:hrstd="t" o:hr="t" fillcolor="#a0a0a0" stroked="f"/>
+          <v:rect id="_x0000_i1043" style="width:0;height:1.5pt" o:hralign="center" o:hrstd="t" o:hr="t" fillcolor="#a0a0a0" stroked="f"/>
         </w:pict>
       </w:r>
     </w:p>
@@ -6869,21 +6685,12 @@
           <w:szCs w:val="18"/>
         </w:rPr>
       </w:pPr>
-      <w:proofErr w:type="spellStart"/>
-      <w:r>
-        <w:rPr>
-          <w:sz w:val="18"/>
-          <w:szCs w:val="18"/>
-        </w:rPr>
-        <w:t>Prescalers</w:t>
-      </w:r>
-      <w:proofErr w:type="spellEnd"/>
-      <w:r>
-        <w:rPr>
-          <w:sz w:val="18"/>
-          <w:szCs w:val="18"/>
-        </w:rPr>
-        <w:t xml:space="preserve"> </w:t>
+      <w:r>
+        <w:rPr>
+          <w:sz w:val="18"/>
+          <w:szCs w:val="18"/>
+        </w:rPr>
+        <w:t xml:space="preserve">Prescalers </w:t>
       </w:r>
     </w:p>
     <w:p>
@@ -6940,23 +6747,7 @@
           <w:sz w:val="18"/>
           <w:szCs w:val="18"/>
         </w:rPr>
-        <w:t xml:space="preserve">Peripheral clock </w:t>
-      </w:r>
-      <w:proofErr w:type="gramStart"/>
-      <w:r>
-        <w:rPr>
-          <w:sz w:val="18"/>
-          <w:szCs w:val="18"/>
-        </w:rPr>
-        <w:t>enable</w:t>
-      </w:r>
-      <w:proofErr w:type="gramEnd"/>
-      <w:r>
-        <w:rPr>
-          <w:sz w:val="18"/>
-          <w:szCs w:val="18"/>
-        </w:rPr>
-        <w:t xml:space="preserve"> </w:t>
+        <w:t xml:space="preserve">Peripheral clock enable </w:t>
       </w:r>
     </w:p>
     <w:p>
@@ -7129,9 +6920,8 @@
           <w:sz w:val="18"/>
           <w:szCs w:val="18"/>
         </w:rPr>
-        <w:lastRenderedPageBreak/>
         <w:pict w14:anchorId="2E02C280">
-          <v:rect id="_x0000_i1194" style="width:0;height:1.5pt" o:hralign="center" o:hrstd="t" o:hr="t" fillcolor="#a0a0a0" stroked="f"/>
+          <v:rect id="_x0000_i1044" style="width:0;height:1.5pt" o:hralign="center" o:hrstd="t" o:hr="t" fillcolor="#a0a0a0" stroked="f"/>
         </w:pict>
       </w:r>
     </w:p>
@@ -7230,39 +7020,7 @@
           <w:sz w:val="18"/>
           <w:szCs w:val="18"/>
         </w:rPr>
-        <w:t xml:space="preserve">    </w:t>
-      </w:r>
-      <w:proofErr w:type="spellStart"/>
-      <w:r>
-        <w:rPr>
-          <w:sz w:val="18"/>
-          <w:szCs w:val="18"/>
-        </w:rPr>
-        <w:t>do_</w:t>
-      </w:r>
-      <w:proofErr w:type="gramStart"/>
-      <w:r>
-        <w:rPr>
-          <w:sz w:val="18"/>
-          <w:szCs w:val="18"/>
-        </w:rPr>
-        <w:t>something</w:t>
-      </w:r>
-      <w:proofErr w:type="spellEnd"/>
-      <w:r>
-        <w:rPr>
-          <w:sz w:val="18"/>
-          <w:szCs w:val="18"/>
-        </w:rPr>
-        <w:t>(</w:t>
-      </w:r>
-      <w:proofErr w:type="gramEnd"/>
-      <w:r>
-        <w:rPr>
-          <w:sz w:val="18"/>
-          <w:szCs w:val="18"/>
-        </w:rPr>
-        <w:t>);</w:t>
+        <w:t xml:space="preserve">    do_something();</w:t>
       </w:r>
     </w:p>
     <w:p>
@@ -7382,86 +7140,22 @@
           <w:sz w:val="18"/>
           <w:szCs w:val="18"/>
         </w:rPr>
-        <w:t xml:space="preserve">    </w:t>
-      </w:r>
-      <w:proofErr w:type="spellStart"/>
-      <w:r>
-        <w:rPr>
-          <w:sz w:val="18"/>
-          <w:szCs w:val="18"/>
-        </w:rPr>
-        <w:t>check_</w:t>
-      </w:r>
-      <w:proofErr w:type="gramStart"/>
-      <w:r>
-        <w:rPr>
-          <w:sz w:val="18"/>
-          <w:szCs w:val="18"/>
-        </w:rPr>
-        <w:t>uart</w:t>
-      </w:r>
-      <w:proofErr w:type="spellEnd"/>
-      <w:r>
-        <w:rPr>
-          <w:sz w:val="18"/>
-          <w:szCs w:val="18"/>
-        </w:rPr>
-        <w:t>(</w:t>
-      </w:r>
-      <w:proofErr w:type="gramEnd"/>
-      <w:r>
-        <w:rPr>
-          <w:sz w:val="18"/>
-          <w:szCs w:val="18"/>
-        </w:rPr>
-        <w:t>);</w:t>
-      </w:r>
-    </w:p>
-    <w:p>
-      <w:pPr>
-        <w:rPr>
-          <w:sz w:val="18"/>
-          <w:szCs w:val="18"/>
-        </w:rPr>
-      </w:pPr>
-      <w:r>
-        <w:rPr>
-          <w:sz w:val="18"/>
-          <w:szCs w:val="18"/>
-        </w:rPr>
-        <w:t xml:space="preserve">    </w:t>
-      </w:r>
-      <w:proofErr w:type="spellStart"/>
-      <w:r>
-        <w:rPr>
-          <w:sz w:val="18"/>
-          <w:szCs w:val="18"/>
-        </w:rPr>
-        <w:t>do_</w:t>
-      </w:r>
-      <w:proofErr w:type="gramStart"/>
-      <w:r>
-        <w:rPr>
-          <w:sz w:val="18"/>
-          <w:szCs w:val="18"/>
-        </w:rPr>
-        <w:t>something</w:t>
-      </w:r>
-      <w:proofErr w:type="spellEnd"/>
-      <w:r>
-        <w:rPr>
-          <w:sz w:val="18"/>
-          <w:szCs w:val="18"/>
-        </w:rPr>
-        <w:t>(</w:t>
-      </w:r>
-      <w:proofErr w:type="gramEnd"/>
-      <w:r>
-        <w:rPr>
-          <w:sz w:val="18"/>
-          <w:szCs w:val="18"/>
-        </w:rPr>
-        <w:t>);</w:t>
+        <w:t xml:space="preserve">    check_uart();</w:t>
+      </w:r>
+    </w:p>
+    <w:p>
+      <w:pPr>
+        <w:rPr>
+          <w:sz w:val="18"/>
+          <w:szCs w:val="18"/>
+        </w:rPr>
+      </w:pPr>
+      <w:r>
+        <w:rPr>
+          <w:sz w:val="18"/>
+          <w:szCs w:val="18"/>
+        </w:rPr>
+        <w:t xml:space="preserve">    do_something();</w:t>
       </w:r>
     </w:p>
     <w:p>
@@ -7797,6 +7491,7 @@
           <w:sz w:val="18"/>
           <w:szCs w:val="18"/>
         </w:rPr>
+        <w:lastRenderedPageBreak/>
         <w:t>Instead of the CPU constantly checking:</w:t>
       </w:r>
     </w:p>
@@ -7827,7 +7522,6 @@
           <w:sz w:val="18"/>
           <w:szCs w:val="18"/>
         </w:rPr>
-        <w:lastRenderedPageBreak/>
         <w:t xml:space="preserve"> |</w:t>
       </w:r>
     </w:p>
@@ -8359,6 +8053,7 @@
           <w:sz w:val="18"/>
           <w:szCs w:val="18"/>
         </w:rPr>
+        <w:lastRenderedPageBreak/>
         <w:t>That's the foundation of 0.10.</w:t>
       </w:r>
     </w:p>
@@ -8397,7 +8092,6 @@
           <w:sz w:val="18"/>
           <w:szCs w:val="18"/>
         </w:rPr>
-        <w:lastRenderedPageBreak/>
         <w:t xml:space="preserve">What is the main difference between </w:t>
       </w:r>
       <w:r>
@@ -8524,37 +8218,12 @@
           <w:szCs w:val="18"/>
         </w:rPr>
       </w:pPr>
-      <w:proofErr w:type="spellStart"/>
-      <w:r>
-        <w:rPr>
-          <w:sz w:val="18"/>
-          <w:szCs w:val="18"/>
-        </w:rPr>
-        <w:t>nvic</w:t>
-      </w:r>
-      <w:proofErr w:type="spellEnd"/>
-      <w:r>
-        <w:rPr>
-          <w:sz w:val="18"/>
-          <w:szCs w:val="18"/>
-        </w:rPr>
-        <w:t xml:space="preserve"> / </w:t>
-      </w:r>
-      <w:proofErr w:type="spellStart"/>
-      <w:r>
-        <w:rPr>
-          <w:sz w:val="18"/>
-          <w:szCs w:val="18"/>
-        </w:rPr>
-        <w:t>cpu</w:t>
-      </w:r>
-      <w:proofErr w:type="spellEnd"/>
-      <w:r>
-        <w:rPr>
-          <w:sz w:val="18"/>
-          <w:szCs w:val="18"/>
-        </w:rPr>
-        <w:t>?</w:t>
+      <w:r>
+        <w:rPr>
+          <w:sz w:val="18"/>
+          <w:szCs w:val="18"/>
+        </w:rPr>
+        <w:t>nvic / cpu?</w:t>
       </w:r>
     </w:p>
     <w:p>
@@ -8711,7 +8380,7 @@
           <w:szCs w:val="18"/>
         </w:rPr>
         <w:pict w14:anchorId="35855F31">
-          <v:rect id="_x0000_i1218" style="width:0;height:1.5pt" o:hralign="center" o:hrstd="t" o:hr="t" fillcolor="#a0a0a0" stroked="f"/>
+          <v:rect id="_x0000_i1045" style="width:0;height:1.5pt" o:hralign="center" o:hrstd="t" o:hr="t" fillcolor="#a0a0a0" stroked="f"/>
         </w:pict>
       </w:r>
     </w:p>
@@ -9050,6 +8719,7 @@
           <w:sz w:val="18"/>
           <w:szCs w:val="18"/>
         </w:rPr>
+        <w:lastRenderedPageBreak/>
         <w:t xml:space="preserve">Enabling/disabling interrupts </w:t>
       </w:r>
     </w:p>
@@ -9069,7 +8739,6 @@
           <w:sz w:val="18"/>
           <w:szCs w:val="18"/>
         </w:rPr>
-        <w:lastRenderedPageBreak/>
         <w:t xml:space="preserve">Nested interrupts </w:t>
       </w:r>
     </w:p>
@@ -9086,7 +8755,7 @@
           <w:szCs w:val="18"/>
         </w:rPr>
         <w:pict w14:anchorId="58A19EE9">
-          <v:rect id="_x0000_i1219" style="width:0;height:1.5pt" o:hralign="center" o:hrstd="t" o:hr="t" fillcolor="#a0a0a0" stroked="f"/>
+          <v:rect id="_x0000_i1046" style="width:0;height:1.5pt" o:hralign="center" o:hrstd="t" o:hr="t" fillcolor="#a0a0a0" stroked="f"/>
         </w:pict>
       </w:r>
     </w:p>
@@ -9481,7 +9150,7 @@
           <w:szCs w:val="18"/>
         </w:rPr>
         <w:pict w14:anchorId="4B5A2EC1">
-          <v:rect id="_x0000_i1220" style="width:0;height:1.5pt" o:hralign="center" o:hrstd="t" o:hr="t" fillcolor="#a0a0a0" stroked="f"/>
+          <v:rect id="_x0000_i1047" style="width:0;height:1.5pt" o:hralign="center" o:hrstd="t" o:hr="t" fillcolor="#a0a0a0" stroked="f"/>
         </w:pict>
       </w:r>
     </w:p>
@@ -9606,94 +9275,53 @@
           <w:sz w:val="18"/>
           <w:szCs w:val="18"/>
         </w:rPr>
-        <w:t xml:space="preserve">When you power on an STM32, how does the CPU actually get from reset </w:t>
-      </w:r>
-      <w:proofErr w:type="gramStart"/>
-      <w:r>
-        <w:rPr>
-          <w:b/>
-          <w:bCs/>
-          <w:sz w:val="18"/>
-          <w:szCs w:val="18"/>
-        </w:rPr>
-        <w:t>to</w:t>
-      </w:r>
-      <w:proofErr w:type="gramEnd"/>
-      <w:r>
-        <w:rPr>
-          <w:b/>
-          <w:bCs/>
-          <w:sz w:val="18"/>
-          <w:szCs w:val="18"/>
-        </w:rPr>
-        <w:t xml:space="preserve"> </w:t>
-      </w:r>
-      <w:proofErr w:type="gramStart"/>
-      <w:r>
-        <w:rPr>
-          <w:b/>
-          <w:bCs/>
-          <w:sz w:val="18"/>
-          <w:szCs w:val="18"/>
-        </w:rPr>
-        <w:t>main(</w:t>
-      </w:r>
-      <w:proofErr w:type="gramEnd"/>
-      <w:r>
-        <w:rPr>
-          <w:b/>
-          <w:bCs/>
-          <w:sz w:val="18"/>
-          <w:szCs w:val="18"/>
-        </w:rPr>
-        <w:t>)?</w:t>
-      </w:r>
-    </w:p>
-    <w:p>
-      <w:pPr>
-        <w:rPr>
-          <w:sz w:val="18"/>
-          <w:szCs w:val="18"/>
-        </w:rPr>
-      </w:pPr>
-    </w:p>
-    <w:p>
-      <w:pPr>
-        <w:rPr>
-          <w:sz w:val="18"/>
-          <w:szCs w:val="18"/>
-        </w:rPr>
-      </w:pPr>
-    </w:p>
-    <w:p>
-      <w:pPr>
-        <w:rPr>
-          <w:sz w:val="18"/>
-          <w:szCs w:val="18"/>
-        </w:rPr>
-      </w:pPr>
-    </w:p>
-    <w:p>
-      <w:pPr>
-        <w:rPr>
-          <w:sz w:val="18"/>
-          <w:szCs w:val="18"/>
-        </w:rPr>
-      </w:pPr>
-    </w:p>
-    <w:p>
-      <w:pPr>
-        <w:rPr>
-          <w:sz w:val="18"/>
-          <w:szCs w:val="18"/>
-        </w:rPr>
-      </w:pPr>
-      <w:r>
-        <w:rPr>
-          <w:sz w:val="18"/>
-          <w:szCs w:val="18"/>
-        </w:rPr>
-        <w:lastRenderedPageBreak/>
+        <w:t>When you power on an STM32, how does the CPU actually get from reset to main()?</w:t>
+      </w:r>
+    </w:p>
+    <w:p>
+      <w:pPr>
+        <w:rPr>
+          <w:sz w:val="18"/>
+          <w:szCs w:val="18"/>
+        </w:rPr>
+      </w:pPr>
+    </w:p>
+    <w:p>
+      <w:pPr>
+        <w:rPr>
+          <w:sz w:val="18"/>
+          <w:szCs w:val="18"/>
+        </w:rPr>
+      </w:pPr>
+    </w:p>
+    <w:p>
+      <w:pPr>
+        <w:rPr>
+          <w:sz w:val="18"/>
+          <w:szCs w:val="18"/>
+        </w:rPr>
+      </w:pPr>
+    </w:p>
+    <w:p>
+      <w:pPr>
+        <w:rPr>
+          <w:sz w:val="18"/>
+          <w:szCs w:val="18"/>
+        </w:rPr>
+      </w:pPr>
+    </w:p>
+    <w:p>
+      <w:pPr>
+        <w:rPr>
+          <w:sz w:val="18"/>
+          <w:szCs w:val="18"/>
+        </w:rPr>
+      </w:pPr>
+      <w:r>
+        <w:rPr>
+          <w:sz w:val="18"/>
+          <w:szCs w:val="18"/>
+        </w:rPr>
         <w:t>We'll trace:</w:t>
       </w:r>
     </w:p>
@@ -9854,52 +9482,27 @@
           <w:szCs w:val="18"/>
         </w:rPr>
       </w:pPr>
-      <w:proofErr w:type="gramStart"/>
-      <w:r>
-        <w:rPr>
-          <w:sz w:val="18"/>
-          <w:szCs w:val="18"/>
-        </w:rPr>
-        <w:t>main(</w:t>
-      </w:r>
-      <w:proofErr w:type="gramEnd"/>
-      <w:r>
-        <w:rPr>
-          <w:sz w:val="18"/>
-          <w:szCs w:val="18"/>
-        </w:rPr>
-        <w:t>)</w:t>
-      </w:r>
-    </w:p>
-    <w:p>
-      <w:pPr>
-        <w:rPr>
-          <w:sz w:val="18"/>
-          <w:szCs w:val="18"/>
-        </w:rPr>
-      </w:pPr>
-      <w:r>
-        <w:rPr>
-          <w:sz w:val="18"/>
-          <w:szCs w:val="18"/>
-        </w:rPr>
-        <w:t xml:space="preserve">And we'll connect this directly to the startup_stm32f103xb.s file you see inside </w:t>
-      </w:r>
-      <w:proofErr w:type="spellStart"/>
-      <w:r>
-        <w:rPr>
-          <w:sz w:val="18"/>
-          <w:szCs w:val="18"/>
-        </w:rPr>
-        <w:t>CubeIDE</w:t>
-      </w:r>
-      <w:proofErr w:type="spellEnd"/>
-      <w:r>
-        <w:rPr>
-          <w:sz w:val="18"/>
-          <w:szCs w:val="18"/>
-        </w:rPr>
-        <w:t>.</w:t>
+      <w:r>
+        <w:rPr>
+          <w:sz w:val="18"/>
+          <w:szCs w:val="18"/>
+        </w:rPr>
+        <w:t>main()</w:t>
+      </w:r>
+    </w:p>
+    <w:p>
+      <w:pPr>
+        <w:rPr>
+          <w:sz w:val="18"/>
+          <w:szCs w:val="18"/>
+        </w:rPr>
+      </w:pPr>
+      <w:r>
+        <w:rPr>
+          <w:sz w:val="18"/>
+          <w:szCs w:val="18"/>
+        </w:rPr>
+        <w:t>And we'll connect this directly to the startup_stm32f103xb.s file you see inside CubeIDE.</w:t>
       </w:r>
     </w:p>
     <w:p>
@@ -11340,6 +10943,7 @@
   <w:style w:type="character" w:default="1" w:styleId="DefaultParagraphFont">
     <w:name w:val="Default Paragraph Font"/>
     <w:uiPriority w:val="1"/>
+    <w:semiHidden/>
     <w:unhideWhenUsed/>
   </w:style>
   <w:style w:type="table" w:default="1" w:styleId="TableNormal">

</xml_diff>